<commit_message>
Update on 27 Jun 2025 at 15:39
</commit_message>
<xml_diff>
--- a/index.docx
+++ b/index.docx
@@ -7,7 +7,13 @@
         <w:pStyle w:val="Heading1"/>
       </w:pPr>
       <w:r>
-        <w:t>Guidelines for Drafting Manuscripts</w:t>
+        <w:t xml:space="preserve">Guidelines </w:t>
+      </w:r>
+      <w:r>
+        <w:t>F</w:t>
+      </w:r>
+      <w:r>
+        <w:t>or Drafting Manuscripts</w:t>
       </w:r>
     </w:p>
     <w:p>
@@ -586,7 +592,13 @@
         <w:jc w:val="both"/>
       </w:pPr>
       <w:r>
-        <w:t>Please draft your manuscript using a standard word processing application (Microsoft Word in particular). You may use your own document or the manuscript template provided.</w:t>
+        <w:t>Please draft your manuscript using a standard word processing application (Microsoft Word in particular). You may use your own document</w:t>
+      </w:r>
+      <w:r>
+        <w:t>,</w:t>
+      </w:r>
+      <w:r>
+        <w:t xml:space="preserve"> or the manuscript template provided.</w:t>
       </w:r>
     </w:p>
     <w:p>
@@ -618,7 +630,19 @@
         <w:pStyle w:val="Heading2"/>
       </w:pPr>
       <w:r>
-        <w:t>Table of contents</w:t>
+        <w:t xml:space="preserve">Table </w:t>
+      </w:r>
+      <w:r>
+        <w:t>O</w:t>
+      </w:r>
+      <w:r>
+        <w:t xml:space="preserve">f </w:t>
+      </w:r>
+      <w:r>
+        <w:t>C</w:t>
+      </w:r>
+      <w:r>
+        <w:t>ontents</w:t>
       </w:r>
       <w:r>
         <w:t xml:space="preserve"> </w:t>

</xml_diff>